<commit_message>
Update 3-Random obstacle size, direction, and speed.docx
</commit_message>
<xml_diff>
--- a/Unit 3 - 2D SpriteFlight/3-Random obstacle size, direction, and speed.docx
+++ b/Unit 3 - 2D SpriteFlight/3-Random obstacle size, direction, and speed.docx
@@ -1,15 +1,16 @@
 
 <file path=word/document.xml><?xml version="1.0" encoding="utf-8"?>
-<w:document xmlns:wpc="http://schemas.microsoft.com/office/word/2010/wordprocessingCanvas" xmlns:cx="http://schemas.microsoft.com/office/drawing/2014/chartex" xmlns:cx1="http://schemas.microsoft.com/office/drawing/2015/9/8/chartex" xmlns:cx2="http://schemas.microsoft.com/office/drawing/2015/10/21/chartex" xmlns:cx3="http://schemas.microsoft.com/office/drawing/2016/5/9/chartex" xmlns:cx4="http://schemas.microsoft.com/office/drawing/2016/5/10/chartex" xmlns:cx5="http://schemas.microsoft.com/office/drawing/2016/5/11/chartex" xmlns:cx6="http://schemas.microsoft.com/office/drawing/2016/5/12/chartex" xmlns:cx7="http://schemas.microsoft.com/office/drawing/2016/5/13/chartex" xmlns:cx8="http://schemas.microsoft.com/office/drawing/2016/5/14/chartex" xmlns:mc="http://schemas.openxmlformats.org/markup-compatibility/2006" xmlns:aink="http://schemas.microsoft.com/office/drawing/2016/ink" xmlns:am3d="http://schemas.microsoft.com/office/drawing/2017/model3d" xmlns:o="urn:schemas-microsoft-com:office:office" xmlns:oel="http://schemas.microsoft.com/office/2019/extlst" xmlns:r="http://schemas.openxmlformats.org/officeDocument/2006/relationships" xmlns:m="http://schemas.openxmlformats.org/officeDocument/2006/math" xmlns:v="urn:schemas-microsoft-com:vml" xmlns:wp14="http://schemas.microsoft.com/office/word/2010/wordprocessingDrawing" xmlns:wp="http://schemas.openxmlformats.org/drawingml/2006/wordprocessingDrawing" xmlns:w10="urn:schemas-microsoft-com:office:word" xmlns:w="http://schemas.openxmlformats.org/wordprocessingml/2006/main" xmlns:w14="http://schemas.microsoft.com/office/word/2010/wordml" xmlns:w15="http://schemas.microsoft.com/office/word/2012/wordml" xmlns:w16cei="http://schemas.microsoft.com/office/word/2026/wordml/cei" xmlns:w16cex="http://schemas.microsoft.com/office/word/2018/wordml/cex" xmlns:w16cid="http://schemas.microsoft.com/office/word/2016/wordml/cid" xmlns:w16="http://schemas.microsoft.com/office/word/2018/wordml" xmlns:w16du="http://schemas.microsoft.com/office/word/2023/wordml/word16du" xmlns:w16sdtdh="http://schemas.microsoft.com/office/word/2020/wordml/sdtdatahash" xmlns:w16sdtfl="http://schemas.microsoft.com/office/word/2024/wordml/sdtformatlock" xmlns:w16se="http://schemas.microsoft.com/office/word/2015/wordml/symex" xmlns:wpg="http://schemas.microsoft.com/office/word/2010/wordprocessingGroup" xmlns:wpi="http://schemas.microsoft.com/office/word/2010/wordprocessingInk" xmlns:wne="http://schemas.microsoft.com/office/word/2006/wordml" xmlns:wps="http://schemas.microsoft.com/office/word/2010/wordprocessingShape" mc:Ignorable="w14 w15 w16se w16cid w16 w16cex w16sdtdh w16sdtfl w16du wp14">
+<w:document xmlns:wpc="http://schemas.microsoft.com/office/word/2010/wordprocessingCanvas" xmlns:cx="http://schemas.microsoft.com/office/drawing/2014/chartex" xmlns:cx1="http://schemas.microsoft.com/office/drawing/2015/9/8/chartex" xmlns:cx2="http://schemas.microsoft.com/office/drawing/2015/10/21/chartex" xmlns:cx3="http://schemas.microsoft.com/office/drawing/2016/5/9/chartex" xmlns:cx4="http://schemas.microsoft.com/office/drawing/2016/5/10/chartex" xmlns:cx5="http://schemas.microsoft.com/office/drawing/2016/5/11/chartex" xmlns:cx6="http://schemas.microsoft.com/office/drawing/2016/5/12/chartex" xmlns:cx7="http://schemas.microsoft.com/office/drawing/2016/5/13/chartex" xmlns:cx8="http://schemas.microsoft.com/office/drawing/2016/5/14/chartex" xmlns:mc="http://schemas.openxmlformats.org/markup-compatibility/2006" xmlns:aink="http://schemas.microsoft.com/office/drawing/2016/ink" xmlns:am3d="http://schemas.microsoft.com/office/drawing/2017/model3d" xmlns:o="urn:schemas-microsoft-com:office:office" xmlns:oel="http://schemas.microsoft.com/office/2019/extlst" xmlns:r="http://schemas.openxmlformats.org/officeDocument/2006/relationships" xmlns:m="http://schemas.openxmlformats.org/officeDocument/2006/math" xmlns:v="urn:schemas-microsoft-com:vml" xmlns:wp14="http://schemas.microsoft.com/office/word/2010/wordprocessingDrawing" xmlns:wp="http://schemas.openxmlformats.org/drawingml/2006/wordprocessingDrawing" xmlns:w10="urn:schemas-microsoft-com:office:word" xmlns:w="http://schemas.openxmlformats.org/wordprocessingml/2006/main" xmlns:w14="http://schemas.microsoft.com/office/word/2010/wordml" xmlns:w15="http://schemas.microsoft.com/office/word/2012/wordml" xmlns:w16cex="http://schemas.microsoft.com/office/word/2018/wordml/cex" xmlns:w16cid="http://schemas.microsoft.com/office/word/2016/wordml/cid" xmlns:w16="http://schemas.microsoft.com/office/word/2018/wordml" xmlns:w16du="http://schemas.microsoft.com/office/word/2023/wordml/word16du" xmlns:w16sdtdh="http://schemas.microsoft.com/office/word/2020/wordml/sdtdatahash" xmlns:w16sdtfl="http://schemas.microsoft.com/office/word/2024/wordml/sdtformatlock" xmlns:w16se="http://schemas.microsoft.com/office/word/2015/wordml/symex" xmlns:wpg="http://schemas.microsoft.com/office/word/2010/wordprocessingGroup" xmlns:wpi="http://schemas.microsoft.com/office/word/2010/wordprocessingInk" xmlns:wne="http://schemas.microsoft.com/office/word/2006/wordml" xmlns:wps="http://schemas.microsoft.com/office/word/2010/wordprocessingShape" mc:Ignorable="w14 w15 w16se w16cid w16 w16cex w16sdtdh w16sdtfl w16du wp14">
   <w:body>
     <w:p>
       <w:r>
-        <w:t>SummarySkills</w:t>
-      </w:r>
-    </w:p>
-    <w:p>
-      <w:r>
-        <w:t>In this tutorial, you’ll write your first Unity script to control how each obstacle behaves. By assigning random properties — like size, direction, and speed — you’ll make your game world feel unpredictable and alive. Along the way, you’ll learn key C# scripting concepts, how to edit prefabs directly, and how to test and tune behaviors in real time.</w:t>
+        <w:t xml:space="preserve">In this </w:t>
+      </w:r>
+      <w:r>
+        <w:t>lab</w:t>
+      </w:r>
+      <w:r>
+        <w:t>, you’ll write your first Unity script to control how each obstacle behaves. By assigning random properties — like size, direction, and speed — you’ll make your game world feel unpredictable and alive. Along the way, you’ll learn key C# scripting concepts, how to edit prefabs directly, and how to test and tune behaviors in real time.</w:t>
       </w:r>
     </w:p>
     <w:p>
@@ -29,26 +30,13 @@
     </w:p>
     <w:p>
       <w:r>
-        <w:rPr>
-          <w:b/>
-          <w:bCs/>
-        </w:rPr>
-        <w:t>Q&amp;A (0)</w:t>
-      </w:r>
-    </w:p>
-    <w:p>
-      <w:r>
-        <w:t>In this tutorial, you’ll write a simple script that gives each obstacle a random size, direction, and speed. You’ll learn the basics of Unity scripting — including how to use variables, random number generation, vector math, and more — to make your game world feel dynamic and unpredictable.</w:t>
-      </w:r>
-    </w:p>
-    <w:p>
-      <w:r>
-        <w:t>Play Video</w:t>
-      </w:r>
-    </w:p>
-    <w:p>
-      <w:r>
-        <w:t>Mark step incomplete</w:t>
+        <w:t xml:space="preserve">In this </w:t>
+      </w:r>
+      <w:r>
+        <w:t>lab</w:t>
+      </w:r>
+      <w:r>
+        <w:t>, you’ll write a simple script that gives each obstacle a random size, direction, and speed. You’ll learn the basics of Unity scripting — including how to use variables, random number generation, vector math, and more — to make your game world feel dynamic and unpredictable.</w:t>
       </w:r>
     </w:p>
     <w:p>
@@ -68,21 +56,18 @@
     </w:p>
     <w:p>
       <w:r>
-        <w:rPr>
-          <w:b/>
-          <w:bCs/>
-        </w:rPr>
-        <w:t>Q&amp;A (0)</w:t>
-      </w:r>
-    </w:p>
-    <w:p>
-      <w:r>
         <w:t>If you’ve never done any programming before, here’s something important to keep in mind: coding can feel confusing at first — and that’s completely normal. It might feel like everything is happening in another language. That’s because, in many ways, it is. Programming is a new way of thinking, and it takes time to get used to the words, structure, and logic behind it.</w:t>
       </w:r>
     </w:p>
     <w:p>
       <w:r>
-        <w:t>Don’t expect to understand everything right away. Instead, think of these tutorials as an introduction to key ideas, or like planting a seed. The goal isn’t to memorize or totally understand it immediately. Instead, the goal is to start recognizing patterns that will make more sense to you each time you see them.</w:t>
+        <w:t xml:space="preserve">Don’t expect to understand everything right away. Instead, think of these </w:t>
+      </w:r>
+      <w:r>
+        <w:t>lab</w:t>
+      </w:r>
+      <w:r>
+        <w:t>s as an introduction to key ideas, or like planting a seed. The goal isn’t to memorize or totally understand it immediately. Instead, the goal is to start recognizing patterns that will make more sense to you each time you see them.</w:t>
       </w:r>
     </w:p>
     <w:p>
@@ -91,11 +76,6 @@
       </w:r>
     </w:p>
     <w:p>
-      <w:r>
-        <w:t>Mark step incomplete</w:t>
-      </w:r>
-    </w:p>
-    <w:p>
       <w:pPr>
         <w:rPr>
           <w:b/>
@@ -112,15 +92,6 @@
     </w:p>
     <w:p>
       <w:r>
-        <w:rPr>
-          <w:b/>
-          <w:bCs/>
-        </w:rPr>
-        <w:t>Q&amp;A (0)</w:t>
-      </w:r>
-    </w:p>
-    <w:p>
-      <w:r>
         <w:t>So far, you’ve added built-in components to your GameObjects — like the </w:t>
       </w:r>
       <w:r>
@@ -187,11 +158,6 @@
       </w:r>
       <w:r>
         <w:t>prefab, so every copy of that prefab uses the same behavior.</w:t>
-      </w:r>
-    </w:p>
-    <w:p>
-      <w:r>
-        <w:t>Play Video</w:t>
       </w:r>
     </w:p>
     <w:p>
@@ -282,6 +248,7 @@
         </w:numPr>
       </w:pPr>
       <w:r>
+        <w:lastRenderedPageBreak/>
         <w:t>Right-click in the </w:t>
       </w:r>
       <w:r>
@@ -529,11 +496,6 @@
       </w:r>
     </w:p>
     <w:p>
-      <w:r>
-        <w:t>Mark step incomplete</w:t>
-      </w:r>
-    </w:p>
-    <w:p>
       <w:pPr>
         <w:rPr>
           <w:b/>
@@ -550,15 +512,6 @@
     </w:p>
     <w:p>
       <w:r>
-        <w:rPr>
-          <w:b/>
-          <w:bCs/>
-        </w:rPr>
-        <w:t>Q&amp;A (0)</w:t>
-      </w:r>
-    </w:p>
-    <w:p>
-      <w:r>
         <w:t>Before you start writing code, it’s helpful to understand the structure of a basic Unity script. When you double-click your script file, Unity will open it in your code editor (like Visual Studio or VS Code).</w:t>
       </w:r>
     </w:p>
@@ -599,6 +552,10 @@
     </w:p>
     <w:p>
       <w:r>
+        <w:rPr>
+          <w:noProof/>
+        </w:rPr>
+        <w:lastRenderedPageBreak/>
         <w:drawing>
           <wp:inline distT="0" distB="0" distL="0" distR="0" wp14:anchorId="5C0EE4B0" wp14:editId="00315BA3">
             <wp:extent cx="20117435" cy="9770745"/>
@@ -655,6 +612,7 @@
           <w:b/>
           <w:bCs/>
         </w:rPr>
+        <w:lastRenderedPageBreak/>
         <w:t>Tip:</w:t>
       </w:r>
       <w:r>
@@ -859,15 +817,6 @@
     </w:p>
     <w:p>
       <w:r>
-        <w:rPr>
-          <w:b/>
-          <w:bCs/>
-        </w:rPr>
-        <w:t>Q&amp;A (0)</w:t>
-      </w:r>
-    </w:p>
-    <w:p>
-      <w:r>
         <w:t>Let’s write your first real line of code. You’ll use the </w:t>
       </w:r>
       <w:r>
@@ -931,11 +880,6 @@
     <w:p>
       <w:r>
         <w:t>If you don’t see suggestions as you type — and you’re using a macOS — you might need to configure your editor to properly support Unity and C#. Once it’s working, autocomplete will save you a lot of time.</w:t>
-      </w:r>
-    </w:p>
-    <w:p>
-      <w:r>
-        <w:t>Play Video</w:t>
       </w:r>
     </w:p>
     <w:p>
@@ -1015,6 +959,7 @@
         </w:numPr>
       </w:pPr>
       <w:r>
+        <w:lastRenderedPageBreak/>
         <w:t>The </w:t>
       </w:r>
       <w:r>
@@ -1192,11 +1137,6 @@
       </w:r>
     </w:p>
     <w:p>
-      <w:r>
-        <w:t>Mark step incomplete</w:t>
-      </w:r>
-    </w:p>
-    <w:p>
       <w:pPr>
         <w:rPr>
           <w:b/>
@@ -1213,15 +1153,6 @@
     </w:p>
     <w:p>
       <w:r>
-        <w:rPr>
-          <w:b/>
-          <w:bCs/>
-        </w:rPr>
-        <w:t>Q&amp;A (0)</w:t>
-      </w:r>
-    </w:p>
-    <w:p>
-      <w:r>
         <w:t>In this step, you’ll use Unity’s </w:t>
       </w:r>
       <w:r>
@@ -1248,11 +1179,6 @@
       </w:r>
       <w:r>
         <w:t> — a piece of data that can change. In this case, you'll store a random number in a variable and then use it to scale the obstacle.</w:t>
-      </w:r>
-    </w:p>
-    <w:p>
-      <w:r>
-        <w:t>Play Video</w:t>
       </w:r>
     </w:p>
     <w:p>
@@ -1422,6 +1348,7 @@
     </w:p>
     <w:p>
       <w:r>
+        <w:lastRenderedPageBreak/>
         <w:t>transform.localScale = new Vector3(randomSize, randomSize, 1);</w:t>
       </w:r>
     </w:p>
@@ -1581,11 +1508,6 @@
       </w:r>
     </w:p>
     <w:p>
-      <w:r>
-        <w:t>Mark step incomplete</w:t>
-      </w:r>
-    </w:p>
-    <w:p>
       <w:pPr>
         <w:rPr>
           <w:b/>
@@ -1602,15 +1524,6 @@
     </w:p>
     <w:p>
       <w:r>
-        <w:rPr>
-          <w:b/>
-          <w:bCs/>
-        </w:rPr>
-        <w:t>Q&amp;A (0)</w:t>
-      </w:r>
-    </w:p>
-    <w:p>
-      <w:r>
         <w:t>Right now, your script uses specific numbers (</w:t>
       </w:r>
       <w:r>
@@ -1647,11 +1560,6 @@
     <w:p>
       <w:r>
         <w:t>In this step, you’ll move your size range values into variables and make your code more flexible.</w:t>
-      </w:r>
-    </w:p>
-    <w:p>
-      <w:r>
-        <w:t>Play Video</w:t>
       </w:r>
     </w:p>
     <w:p>
@@ -1829,6 +1737,7 @@
         </w:numPr>
       </w:pPr>
       <w:r>
+        <w:lastRenderedPageBreak/>
         <w:t>Return to Unity and enter Play mode — you should still see varying obstacle sizes as you did before, but now they’re using cleaner code!</w:t>
       </w:r>
     </w:p>
@@ -1838,11 +1747,6 @@
       </w:r>
     </w:p>
     <w:p>
-      <w:r>
-        <w:t>Mark step incomplete</w:t>
-      </w:r>
-    </w:p>
-    <w:p>
       <w:pPr>
         <w:rPr>
           <w:b/>
@@ -1855,15 +1759,6 @@
           <w:bCs/>
         </w:rPr>
         <w:t>8. Auto-format your code</w:t>
-      </w:r>
-    </w:p>
-    <w:p>
-      <w:r>
-        <w:rPr>
-          <w:b/>
-          <w:bCs/>
-        </w:rPr>
-        <w:t>Q&amp;A (0)</w:t>
       </w:r>
     </w:p>
     <w:p>
@@ -2041,15 +1936,6 @@
     </w:p>
     <w:p>
       <w:r>
-        <w:rPr>
-          <w:b/>
-          <w:bCs/>
-        </w:rPr>
-        <w:t>Q&amp;A (0)</w:t>
-      </w:r>
-    </w:p>
-    <w:p>
-      <w:r>
         <w:t>So far, your obstacles can fall and bounce, but they don’t move on their own. In this step, you’ll apply a force to each one using Unity’s physics system so they shoot off in a direction when the game starts.</w:t>
       </w:r>
     </w:p>
@@ -2091,11 +1977,6 @@
     <w:p>
       <w:r>
         <w:t>This step introduces a core Unity concept: getting references to components in code.</w:t>
-      </w:r>
-    </w:p>
-    <w:p>
-      <w:r>
-        <w:t>Play Video</w:t>
       </w:r>
     </w:p>
     <w:p>
@@ -2145,6 +2026,7 @@
     </w:p>
     <w:p>
       <w:r>
+        <w:lastRenderedPageBreak/>
         <w:t>This creates a variable that will hold a reference to the obstacle’s </w:t>
       </w:r>
       <w:r>
@@ -2509,11 +2391,6 @@
       </w:r>
     </w:p>
     <w:p>
-      <w:r>
-        <w:t>Mark step incomplete</w:t>
-      </w:r>
-    </w:p>
-    <w:p>
       <w:pPr>
         <w:rPr>
           <w:b/>
@@ -2530,15 +2407,6 @@
     </w:p>
     <w:p>
       <w:r>
-        <w:rPr>
-          <w:b/>
-          <w:bCs/>
-        </w:rPr>
-        <w:t>Q&amp;A (0)</w:t>
-      </w:r>
-    </w:p>
-    <w:p>
-      <w:r>
         <w:t>Right now, your obstacle moves — but gravity is still pulling it downward. In your game, you want the obstacles to float and bounce freely without falling over time. To achieve that, you’ll set the </w:t>
       </w:r>
       <w:r>
@@ -2589,15 +2457,11 @@
     </w:p>
     <w:p>
       <w:r>
-        <w:t>Play Video</w:t>
-      </w:r>
-    </w:p>
-    <w:p>
-      <w:r>
-        <w:rPr>
-          <w:b/>
-          <w:bCs/>
-        </w:rPr>
+        <w:rPr>
+          <w:b/>
+          <w:bCs/>
+        </w:rPr>
+        <w:lastRenderedPageBreak/>
         <w:t>1. Select the Obstacle prefab:</w:t>
       </w:r>
     </w:p>
@@ -2734,11 +2598,6 @@
       </w:r>
     </w:p>
     <w:p>
-      <w:r>
-        <w:t>Mark step incomplete</w:t>
-      </w:r>
-    </w:p>
-    <w:p>
       <w:pPr>
         <w:rPr>
           <w:b/>
@@ -2755,26 +2614,12 @@
     </w:p>
     <w:p>
       <w:r>
-        <w:rPr>
-          <w:b/>
-          <w:bCs/>
-        </w:rPr>
-        <w:t>Q&amp;A (0)</w:t>
-      </w:r>
-    </w:p>
-    <w:p>
-      <w:r>
         <w:t>In this step, you’ll make each obstacle move at a random speed using the same technique you used to randomize the size: define a range and pick a random value within it.</w:t>
       </w:r>
     </w:p>
     <w:p>
       <w:r>
         <w:t>This will add variety and make the game feel more dynamic.</w:t>
-      </w:r>
-    </w:p>
-    <w:p>
-      <w:r>
-        <w:t>Play Video</w:t>
       </w:r>
     </w:p>
     <w:p>
@@ -2989,11 +2834,6 @@
       </w:r>
     </w:p>
     <w:p>
-      <w:r>
-        <w:t>Mark step incomplete</w:t>
-      </w:r>
-    </w:p>
-    <w:p>
       <w:pPr>
         <w:rPr>
           <w:b/>
@@ -3010,15 +2850,7 @@
     </w:p>
     <w:p>
       <w:r>
-        <w:rPr>
-          <w:b/>
-          <w:bCs/>
-        </w:rPr>
-        <w:t>Q&amp;A (0)</w:t>
-      </w:r>
-    </w:p>
-    <w:p>
-      <w:r>
+        <w:lastRenderedPageBreak/>
         <w:t>Right now, all obstacles launch in the same direction. In this step, you’ll replace the fixed </w:t>
       </w:r>
       <w:r>
@@ -3045,11 +2877,6 @@
     <w:p>
       <w:r>
         <w:t>This function gives you a random point inside a circle with a radius of 1 — perfect for generating unpredictable motion in 2D space.</w:t>
-      </w:r>
-    </w:p>
-    <w:p>
-      <w:r>
-        <w:t>Play Video</w:t>
       </w:r>
     </w:p>
     <w:p>
@@ -3281,11 +3108,6 @@
       </w:r>
     </w:p>
     <w:p>
-      <w:r>
-        <w:t>Mark step incomplete</w:t>
-      </w:r>
-    </w:p>
-    <w:p>
       <w:pPr>
         <w:rPr>
           <w:b/>
@@ -3302,15 +3124,6 @@
     </w:p>
     <w:p>
       <w:r>
-        <w:rPr>
-          <w:b/>
-          <w:bCs/>
-        </w:rPr>
-        <w:t>Q&amp;A (0)</w:t>
-      </w:r>
-    </w:p>
-    <w:p>
-      <w:r>
         <w:t>At this point, your </w:t>
       </w:r>
       <w:r>
@@ -3387,11 +3200,6 @@
       </w:r>
       <w:r>
         <w:t>window. This lets you experiment and adjust behavior without touching the code again — a key workflow when collaborating with designers or fine-tuning gameplay.</w:t>
-      </w:r>
-    </w:p>
-    <w:p>
-      <w:r>
-        <w:t>Play Video</w:t>
       </w:r>
     </w:p>
     <w:p>
@@ -3446,6 +3254,7 @@
     </w:p>
     <w:p>
       <w:r>
+        <w:lastRenderedPageBreak/>
         <w:t>public float minSpeed = 50f;</w:t>
       </w:r>
     </w:p>
@@ -3694,15 +3503,6 @@
     </w:p>
     <w:p>
       <w:r>
-        <w:rPr>
-          <w:b/>
-          <w:bCs/>
-        </w:rPr>
-        <w:t>Q&amp;A (0)</w:t>
-      </w:r>
-    </w:p>
-    <w:p>
-      <w:r>
         <w:t>If you have any errors in your code or you just want to make sure your script matches exactly what has been taught up to this point, feel free to reference or copy the final code sample below.</w:t>
       </w:r>
     </w:p>
@@ -3760,6 +3560,7 @@
     <w:p/>
     <w:p>
       <w:r>
+        <w:lastRenderedPageBreak/>
         <w:t xml:space="preserve">    Rigidbody2D rb;</w:t>
       </w:r>
     </w:p>
@@ -3817,20 +3618,6 @@
       </w:r>
     </w:p>
     <w:p>
-      <w:r>
-        <w:t>Mark step incomplete</w:t>
-      </w:r>
-    </w:p>
-    <w:p>
-      <w:r>
-        <w:rPr>
-          <w:b/>
-          <w:bCs/>
-        </w:rPr>
-        <w:t>Optional step</w:t>
-      </w:r>
-    </w:p>
-    <w:p>
       <w:pPr>
         <w:rPr>
           <w:b/>
@@ -3847,15 +3634,6 @@
     </w:p>
     <w:p>
       <w:r>
-        <w:rPr>
-          <w:b/>
-          <w:bCs/>
-        </w:rPr>
-        <w:t>Q&amp;A (0)</w:t>
-      </w:r>
-    </w:p>
-    <w:p>
-      <w:r>
         <w:t>Try these optional activities to challenge yourself, build your skills, and improve your project.</w:t>
       </w:r>
     </w:p>
@@ -3891,7 +3669,13 @@
         <w:t>Expert</w:t>
       </w:r>
       <w:r>
-        <w:t> difficulty so that you know what to expect. You can complete one, all, or none of them — it’s totally up to you. If you’re not interested in doing these challenges, mark this step as complete and proceed to the next tutorial.</w:t>
+        <w:t xml:space="preserve"> difficulty so that you know what to expect. You can complete one, all, or none of them — it’s totally up to you. If you’re not interested in doing these challenges, mark this step as complete and proceed to the next </w:t>
+      </w:r>
+      <w:r>
+        <w:t>lab</w:t>
+      </w:r>
+      <w:r>
+        <w:t>.</w:t>
       </w:r>
     </w:p>
     <w:p>
@@ -3916,6 +3700,10 @@
     </w:p>
     <w:p>
       <w:r>
+        <w:rPr>
+          <w:noProof/>
+        </w:rPr>
+        <w:lastRenderedPageBreak/>
         <w:drawing>
           <wp:inline distT="0" distB="0" distL="0" distR="0" wp14:anchorId="42682D3F" wp14:editId="489386B2">
             <wp:extent cx="8439150" cy="4838700"/>
@@ -4084,6 +3872,7 @@
     </w:p>
     <w:p>
       <w:r>
+        <w:lastRenderedPageBreak/>
         <w:t>Play Video</w:t>
       </w:r>
     </w:p>
@@ -4156,7 +3945,7 @@
 </file>
 
 <file path=word/numbering.xml><?xml version="1.0" encoding="utf-8"?>
-<w:numbering xmlns:wpc="http://schemas.microsoft.com/office/word/2010/wordprocessingCanvas" xmlns:cx="http://schemas.microsoft.com/office/drawing/2014/chartex" xmlns:cx1="http://schemas.microsoft.com/office/drawing/2015/9/8/chartex" xmlns:cx2="http://schemas.microsoft.com/office/drawing/2015/10/21/chartex" xmlns:cx3="http://schemas.microsoft.com/office/drawing/2016/5/9/chartex" xmlns:cx4="http://schemas.microsoft.com/office/drawing/2016/5/10/chartex" xmlns:cx5="http://schemas.microsoft.com/office/drawing/2016/5/11/chartex" xmlns:cx6="http://schemas.microsoft.com/office/drawing/2016/5/12/chartex" xmlns:cx7="http://schemas.microsoft.com/office/drawing/2016/5/13/chartex" xmlns:cx8="http://schemas.microsoft.com/office/drawing/2016/5/14/chartex" xmlns:mc="http://schemas.openxmlformats.org/markup-compatibility/2006" xmlns:aink="http://schemas.microsoft.com/office/drawing/2016/ink" xmlns:am3d="http://schemas.microsoft.com/office/drawing/2017/model3d" xmlns:o="urn:schemas-microsoft-com:office:office" xmlns:oel="http://schemas.microsoft.com/office/2019/extlst" xmlns:r="http://schemas.openxmlformats.org/officeDocument/2006/relationships" xmlns:m="http://schemas.openxmlformats.org/officeDocument/2006/math" xmlns:v="urn:schemas-microsoft-com:vml" xmlns:wp14="http://schemas.microsoft.com/office/word/2010/wordprocessingDrawing" xmlns:wp="http://schemas.openxmlformats.org/drawingml/2006/wordprocessingDrawing" xmlns:w10="urn:schemas-microsoft-com:office:word" xmlns:w="http://schemas.openxmlformats.org/wordprocessingml/2006/main" xmlns:w14="http://schemas.microsoft.com/office/word/2010/wordml" xmlns:w15="http://schemas.microsoft.com/office/word/2012/wordml" xmlns:w16cei="http://schemas.microsoft.com/office/word/2026/wordml/cei" xmlns:w16cex="http://schemas.microsoft.com/office/word/2018/wordml/cex" xmlns:w16cid="http://schemas.microsoft.com/office/word/2016/wordml/cid" xmlns:w16="http://schemas.microsoft.com/office/word/2018/wordml" xmlns:w16du="http://schemas.microsoft.com/office/word/2023/wordml/word16du" xmlns:w16sdtdh="http://schemas.microsoft.com/office/word/2020/wordml/sdtdatahash" xmlns:w16sdtfl="http://schemas.microsoft.com/office/word/2024/wordml/sdtformatlock" xmlns:w16se="http://schemas.microsoft.com/office/word/2015/wordml/symex" xmlns:wpg="http://schemas.microsoft.com/office/word/2010/wordprocessingGroup" xmlns:wpi="http://schemas.microsoft.com/office/word/2010/wordprocessingInk" xmlns:wne="http://schemas.microsoft.com/office/word/2006/wordml" xmlns:wps="http://schemas.microsoft.com/office/word/2010/wordprocessingShape" mc:Ignorable="w14 w15 w16se w16cid w16 w16cex w16sdtdh w16sdtfl w16du wp14">
+<w:numbering xmlns:wpc="http://schemas.microsoft.com/office/word/2010/wordprocessingCanvas" xmlns:cx="http://schemas.microsoft.com/office/drawing/2014/chartex" xmlns:cx1="http://schemas.microsoft.com/office/drawing/2015/9/8/chartex" xmlns:cx2="http://schemas.microsoft.com/office/drawing/2015/10/21/chartex" xmlns:cx3="http://schemas.microsoft.com/office/drawing/2016/5/9/chartex" xmlns:cx4="http://schemas.microsoft.com/office/drawing/2016/5/10/chartex" xmlns:cx5="http://schemas.microsoft.com/office/drawing/2016/5/11/chartex" xmlns:cx6="http://schemas.microsoft.com/office/drawing/2016/5/12/chartex" xmlns:cx7="http://schemas.microsoft.com/office/drawing/2016/5/13/chartex" xmlns:cx8="http://schemas.microsoft.com/office/drawing/2016/5/14/chartex" xmlns:mc="http://schemas.openxmlformats.org/markup-compatibility/2006" xmlns:aink="http://schemas.microsoft.com/office/drawing/2016/ink" xmlns:am3d="http://schemas.microsoft.com/office/drawing/2017/model3d" xmlns:o="urn:schemas-microsoft-com:office:office" xmlns:oel="http://schemas.microsoft.com/office/2019/extlst" xmlns:r="http://schemas.openxmlformats.org/officeDocument/2006/relationships" xmlns:m="http://schemas.openxmlformats.org/officeDocument/2006/math" xmlns:v="urn:schemas-microsoft-com:vml" xmlns:wp14="http://schemas.microsoft.com/office/word/2010/wordprocessingDrawing" xmlns:wp="http://schemas.openxmlformats.org/drawingml/2006/wordprocessingDrawing" xmlns:w10="urn:schemas-microsoft-com:office:word" xmlns:w="http://schemas.openxmlformats.org/wordprocessingml/2006/main" xmlns:w14="http://schemas.microsoft.com/office/word/2010/wordml" xmlns:w15="http://schemas.microsoft.com/office/word/2012/wordml" xmlns:w16cex="http://schemas.microsoft.com/office/word/2018/wordml/cex" xmlns:w16cid="http://schemas.microsoft.com/office/word/2016/wordml/cid" xmlns:w16="http://schemas.microsoft.com/office/word/2018/wordml" xmlns:w16du="http://schemas.microsoft.com/office/word/2023/wordml/word16du" xmlns:w16sdtdh="http://schemas.microsoft.com/office/word/2020/wordml/sdtdatahash" xmlns:w16sdtfl="http://schemas.microsoft.com/office/word/2024/wordml/sdtformatlock" xmlns:w16se="http://schemas.microsoft.com/office/word/2015/wordml/symex" xmlns:wpg="http://schemas.microsoft.com/office/word/2010/wordprocessingGroup" xmlns:wpi="http://schemas.microsoft.com/office/word/2010/wordprocessingInk" xmlns:wne="http://schemas.microsoft.com/office/word/2006/wordml" xmlns:wps="http://schemas.microsoft.com/office/word/2010/wordprocessingShape" mc:Ignorable="w14 w15 w16se w16cid w16 w16cex w16sdtdh w16sdtfl w16du wp14">
   <w:abstractNum w:abstractNumId="0" w15:restartNumberingAfterBreak="0">
     <w:nsid w:val="04A84B0B"/>
     <w:multiLevelType w:val="multilevel"/>
@@ -11299,6 +11088,7 @@
   <w:style w:type="character" w:default="1" w:styleId="DefaultParagraphFont">
     <w:name w:val="Default Paragraph Font"/>
     <w:uiPriority w:val="1"/>
+    <w:semiHidden/>
     <w:unhideWhenUsed/>
   </w:style>
   <w:style w:type="table" w:default="1" w:styleId="TableNormal">

</xml_diff>